<commit_message>
Refactor: Remove redundant descriptions and streamline sidebar navigation
- Removed unnecessary descriptions from ReportRKACost.html, RkaIncome.html, and Rkacost.html to enhance clarity.
- Updated sidebar.js to simplify navigation by removing unused items.
- Added new files for mapping budget codes and a proposal document.
</commit_message>
<xml_diff>
--- a/brief/Proposal Jasa Software Yayasan Bakti Tunas Husada Tasikmalaya.docx
+++ b/brief/Proposal Jasa Software Yayasan Bakti Tunas Husada Tasikmalaya.docx
@@ -531,6 +531,7 @@
                 <w:bCs/>
                 <w:sz w:val="20"/>
                 <w:szCs w:val="20"/>
+                <w:highlight w:val="green"/>
               </w:rPr>
               <w:t>login/Logout</w:t>
             </w:r>
@@ -634,6 +635,7 @@
                 <w:bCs/>
                 <w:sz w:val="20"/>
                 <w:szCs w:val="20"/>
+                <w:highlight w:val="green"/>
               </w:rPr>
               <w:t>Profil</w:t>
             </w:r>
@@ -740,6 +742,7 @@
                 <w:bCs/>
                 <w:sz w:val="20"/>
                 <w:szCs w:val="20"/>
+                <w:highlight w:val="green"/>
               </w:rPr>
               <w:t>Master User</w:t>
             </w:r>
@@ -843,6 +846,7 @@
                 <w:bCs/>
                 <w:sz w:val="20"/>
                 <w:szCs w:val="20"/>
+                <w:highlight w:val="green"/>
               </w:rPr>
               <w:t>Master COA</w:t>
             </w:r>

</xml_diff>